<commit_message>
Peticiones de oración: leyenda de privacidad al capturar
- Alerta visible en el formulario de captura: pide confirmar que la persona está de acuerdo en
  quién leerá su petición (según el alcance elegido), indica si el nombre queda oculto y los días
  tras los que se borra
- El formulario informa los días de conservación vigentes (configurable) para la leyenda
- Documentación y matriz actualizadas

Co-Authored-By: Claude Sonnet 5.5 <noreply@anthropic.com>
</commit_message>
<xml_diff>
--- a/docs/requerimientos/v3.10 - MVP.docx
+++ b/docs/requerimientos/v3.10 - MVP.docx
@@ -6519,7 +6519,7 @@
                 <w:sz w:val="20"/>
                 <w:szCs w:val="20"/>
               </w:rPr>
-              <w:t xml:space="preserve">Equipo de oración: rol configurable (Equipo de oración) que se asigna a las personas que se reúnen a orar por las peticiones compartidas con ese alcance; no da acceso a nada más. Opción de ocultar el nombre de quien pide: los campos del formulario marcados «identifica a la persona» solo los ven líderes y quien registró.</w:t>
+              <w:t xml:space="preserve">Equipo de oración: rol configurable (Equipo de oración) que se asigna a las personas que se reúnen a orar por las peticiones compartidas con ese alcance; no da acceso a nada más. Opción de ocultar el nombre de quien pide: los campos del formulario marcados «identifica a la persona» solo los ven líderes y quien registró. Al capturar se muestra una leyenda que pide confirmar la autorización de quien pide, indica quién la leerá y cuándo se borra.</w:t>
             </w:r>
           </w:p>
         </w:tc>
@@ -21320,7 +21320,7 @@
                 <w:sz w:val="20"/>
                 <w:szCs w:val="20"/>
               </w:rPr>
-              <w:t xml:space="preserve">Pendiente</w:t>
+              <w:t xml:space="preserve">Implementado</w:t>
             </w:r>
           </w:p>
         </w:tc>
@@ -21347,7 +21347,7 @@
                 <w:sz w:val="20"/>
                 <w:szCs w:val="20"/>
               </w:rPr>
-              <w:t xml:space="preserve">Texto de privacidad específico para peticiones, que informe a quien las pide quién podrá leerlas según el alcance.</w:t>
+              <w:t xml:space="preserve">Leyenda de privacidad visible al capturar una petición: pide confirmar que la persona está de acuerdo en quién la leerá (según el alcance elegido), indica si su nombre queda oculto y los días tras los cuales se borra (configurable). No sustituye al aviso de privacidad oficial de la iglesia.</w:t>
             </w:r>
           </w:p>
         </w:tc>

</xml_diff>